<commit_message>
Connect genuine reference candidate validation
</commit_message>
<xml_diff>
--- a/docs/HaradiBots_Architecture_v3.1_Reality_Aligned_DRAFT.docx
+++ b/docs/HaradiBots_Architecture_v3.1_Reality_Aligned_DRAFT.docx
@@ -462,6 +462,31 @@
     <w:p>
       <w:r>
         <w:t>PERSIST → TEARDOWN → IDLE</w:t>
+      </w:r>
+    </w:p>
+    <w:p>
+      <w:r>
+        <w:t>The validate path now has concrete evaluator adapters: Transformers evaluates</w:t>
+      </w:r>
+    </w:p>
+    <w:p>
+      <w:r>
+        <w:t>canonical repositories in-process with lazy imports, while GGUF evaluation uses</w:t>
+      </w:r>
+    </w:p>
+    <w:p>
+      <w:r>
+        <w:t>the separately packaged `llama-perplexity` subprocess. Both evaluators receive</w:t>
+      </w:r>
+    </w:p>
+    <w:p>
+      <w:r>
+        <w:t>identical domain text. A validation result is persisted only after strict</w:t>
+      </w:r>
+    </w:p>
+    <w:p>
+      <w:r>
+        <w:t>schema validation; critical results fail closed.</w:t>
       </w:r>
     </w:p>
     <w:p>

</xml_diff>

<commit_message>
Validate produced quantization artifacts
</commit_message>
<xml_diff>
--- a/docs/HaradiBots_Architecture_v3.1_Reality_Aligned_DRAFT.docx
+++ b/docs/HaradiBots_Architecture_v3.1_Reality_Aligned_DRAFT.docx
@@ -347,6 +347,36 @@
     <w:p>
       <w:r>
         <w:t>is not a successful quantization job.</w:t>
+      </w:r>
+    </w:p>
+    <w:p>
+      <w:r>
+        <w:t>The quantization path acquires conversion inputs under the sandbox cache,</w:t>
+      </w:r>
+    </w:p>
+    <w:p>
+      <w:r>
+        <w:t>selects a backend from the requested target format, captures the concrete</w:t>
+      </w:r>
+    </w:p>
+    <w:p>
+      <w:r>
+        <w:t>artifact emitted by that worker, and constructs the candidate reference used by</w:t>
+      </w:r>
+    </w:p>
+    <w:p>
+      <w:r>
+        <w:t>the strict validation service. llama.cpp conversion is split into isolated</w:t>
+      </w:r>
+    </w:p>
+    <w:p>
+      <w:r>
+        <w:t>full-precision conversion and quantization subprocesses. A missing output path,</w:t>
+      </w:r>
+    </w:p>
+    <w:p>
+      <w:r>
+        <w:t>empty artifact, unsupported target, or quarantined result prevents success.</w:t>
       </w:r>
     </w:p>
     <w:p>

</xml_diff>

<commit_message>
Implement fault tolerance and safe purge
</commit_message>
<xml_diff>
--- a/docs/HaradiBots_Architecture_v3.1_Reality_Aligned_DRAFT.docx
+++ b/docs/HaradiBots_Architecture_v3.1_Reality_Aligned_DRAFT.docx
@@ -819,6 +819,59 @@
         <w:pStyle w:val="Heading1"/>
       </w:pPr>
       <w:r>
+        <w:t>7.1 Fault tolerance and irreversible purge</w:t>
+      </w:r>
+    </w:p>
+    <w:p>
+      <w:r>
+        <w:t>OOM recovery halves batch size for three retries before rebuilding execution on</w:t>
+      </w:r>
+    </w:p>
+    <w:p>
+      <w:r>
+        <w:t>the CPU GGUF backend with detected P-core affinity. CPU-path exhaustion emits</w:t>
+      </w:r>
+    </w:p>
+    <w:p>
+      <w:r>
+        <w:t>an emergency stop and preserves partial artifacts.</w:t>
+      </w:r>
+    </w:p>
+    <w:p>
+      <w:r>
+        <w:t>Purge is ordered as an irreversible transaction boundary: harvest registered</w:t>
+      </w:r>
+    </w:p>
+    <w:p>
+      <w:r>
+        <w:t>workers, drop managed SQLite tables while connected, checkpoint and close</w:t>
+      </w:r>
+    </w:p>
+    <w:p>
+      <w:r>
+        <w:t>SQLite plus Redis pools/processes, delete cache entries deepest-first without</w:t>
+      </w:r>
+    </w:p>
+    <w:p>
+      <w:r>
+        <w:t>following symlinks, then recreate a pristine fixed directory tree. Unsafe roots</w:t>
+      </w:r>
+    </w:p>
+    <w:p>
+      <w:r>
+        <w:t>are rejected before any mutation. CLI and GUI both require a warning</w:t>
+      </w:r>
+    </w:p>
+    <w:p>
+      <w:r>
+        <w:t>acknowledgement followed by the exact text `CONFIRM`.</w:t>
+      </w:r>
+    </w:p>
+    <w:p>
+      <w:pPr>
+        <w:pStyle w:val="Heading1"/>
+      </w:pPr>
+      <w:r>
         <w:t>8. Production acceptance gate</w:t>
       </w:r>
     </w:p>

</xml_diff>

<commit_message>
Add offline packaging and CI gates
</commit_message>
<xml_diff>
--- a/docs/HaradiBots_Architecture_v3.1_Reality_Aligned_DRAFT.docx
+++ b/docs/HaradiBots_Architecture_v3.1_Reality_Aligned_DRAFT.docx
@@ -978,6 +978,59 @@
         <w:t>tested,” or “externally verified” precisely and must not use “production-ready.”</w:t>
       </w:r>
     </w:p>
+    <w:p>
+      <w:pPr>
+        <w:pStyle w:val="Heading1"/>
+      </w:pPr>
+      <w:r>
+        <w:t>9. Packaging evidence</w:t>
+      </w:r>
+    </w:p>
+    <w:p>
+      <w:r>
+        <w:t>The one-dir Fat Binary build has a fail-closed native manifest. llama.cpp CLI,</w:t>
+      </w:r>
+    </w:p>
+    <w:p>
+      <w:r>
+        <w:t>quantizer, perplexity evaluator, conversion script, and Redis must exist in the</w:t>
+      </w:r>
+    </w:p>
+    <w:p>
+      <w:r>
+        <w:t>vendor tree before a release build. Frozen runtime discovery sets their paths</w:t>
+      </w:r>
+    </w:p>
+    <w:p>
+      <w:r>
+        <w:t>without networking. The Docker API runs as a non-root user and exposes only its</w:t>
+      </w:r>
+    </w:p>
+    <w:p>
+      <w:r>
+        <w:t>health/API port.</w:t>
+      </w:r>
+    </w:p>
+    <w:p>
+      <w:r>
+        <w:t>Static packaging tests pass, but this host has neither the native vendor payload</w:t>
+      </w:r>
+    </w:p>
+    <w:p>
+      <w:r>
+        <w:t>nor Docker. Therefore offline Fat Binary execution and container startup remain</w:t>
+      </w:r>
+    </w:p>
+    <w:p>
+      <w:r>
+        <w:t>unverified release gates. Current measured coverage is 46.64%; the required 80%</w:t>
+      </w:r>
+    </w:p>
+    <w:p>
+      <w:r>
+        <w:t>gate is also not yet satisfied.</w:t>
+      </w:r>
+    </w:p>
     <w:sectPr>
       <w:pgSz w:w="12240" w:h="15840"/>
       <w:pgMar w:top="1440" w:right="1800" w:bottom="1440" w:left="1800" w:header="720" w:footer="720" w:gutter="0"/>

</xml_diff>

<commit_message>
Add secure optional cluster foundation
</commit_message>
<xml_diff>
--- a/docs/HaradiBots_Architecture_v3.1_Reality_Aligned_DRAFT.docx
+++ b/docs/HaradiBots_Architecture_v3.1_Reality_Aligned_DRAFT.docx
@@ -815,6 +815,31 @@
       </w:r>
     </w:p>
     <w:p>
+      <w:r>
+        <w:t>The optional cluster foundation now includes certificate provisioning,</w:t>
+      </w:r>
+    </w:p>
+    <w:p>
+      <w:r>
+        <w:t>mTLS-only node inventory, healthy-GPU-only planning, and lazy scheduler</w:t>
+      </w:r>
+    </w:p>
+    <w:p>
+      <w:r>
+        <w:t>adapters. These components are unit tested, but real scheduler execution and</w:t>
+      </w:r>
+    </w:p>
+    <w:p>
+      <w:r>
+        <w:t>artifact return are not externally verified and therefore remain outside the</w:t>
+      </w:r>
+    </w:p>
+    <w:p>
+      <w:r>
+        <w:t>production-complete claim.</w:t>
+      </w:r>
+    </w:p>
+    <w:p>
       <w:pPr>
         <w:pStyle w:val="Heading1"/>
       </w:pPr>

</xml_diff>